<commit_message>
v0.2 first complete main text draft
</commit_message>
<xml_diff>
--- a/2026-Jornal-Doruk-ONNX/Responses.docx
+++ b/2026-Jornal-Doruk-ONNX/Responses.docx
@@ -60,7 +60,13 @@
         <w:jc w:val="both"/>
       </w:pPr>
       <w:r>
-        <w:t>The novelty of the core methodology is limited. The main techniques employed in this work (MLP, ONNX conversion, and dynamic/static quantization) are all standard and mature technologies. Therefore, the paper appears more as an engineering optimization study rather than a methodological contribution. Although the reported reduction in inference latency to $64\text{ ns}$ seems impressive, several missing evaluations make the practical contribution and significance of the optimization unclear.</w:t>
+        <w:t>The novelty of the core methodology is limited. The main techniques employed in this work (MLP, ONNX conversion, and dynamic/static quantization) are all standard and mature technologies. Therefore, the paper appears more as an engineering optimization study rather than a methodological contribution. Although the reported reduction in inference latency to 64</w:t>
+      </w:r>
+      <w:r>
+        <w:t>ns</w:t>
+      </w:r>
+      <w:r>
+        <w:t xml:space="preserve"> seems impressive, several missing evaluations make the practical contribution and significance of the optimization unclear.</w:t>
       </w:r>
       <w:r>
         <w:br/>
@@ -160,7 +166,31 @@
         <w:jc w:val="both"/>
       </w:pPr>
       <w:r>
-        <w:t>Lack of end-to-end comparison with existing works. The paper only compares the proposed model under different optimization settings (Keras vs. ONNX runtime and different quantization schemes), but does not provide any comparison with existing approaches discussed in Section 2 under similar optimization conditions. In particular, for existing models beyond MLP, it remains unclear whether similar ONNX conversion and quantization pipelines would yield comparable latency improvements. Without such comparisons, it is difficult to determine whether the observed speedup originates from the proposed design itself or simply from standard deployment optimization techniques.</w:t>
+        <w:t>Lack of end-to-end comparison with existing works. The paper only compares the proposed model under different optimization settings (</w:t>
+      </w:r>
+      <w:proofErr w:type="spellStart"/>
+      <w:r>
+        <w:t>Keras</w:t>
+      </w:r>
+      <w:proofErr w:type="spellEnd"/>
+      <w:r>
+        <w:t xml:space="preserve"> vs. ONNX runtime and different quantization schemes</w:t>
+      </w:r>
+      <w:proofErr w:type="gramStart"/>
+      <w:r>
+        <w:t>), but</w:t>
+      </w:r>
+      <w:proofErr w:type="gramEnd"/>
+      <w:r>
+        <w:t xml:space="preserve"> does not provide any comparison with existing approaches discussed in Section 2 under similar optimization conditions. </w:t>
+      </w:r>
+      <w:proofErr w:type="gramStart"/>
+      <w:r>
+        <w:t>In particular, for</w:t>
+      </w:r>
+      <w:proofErr w:type="gramEnd"/>
+      <w:r>
+        <w:t xml:space="preserve"> existing models beyond MLP, it remains unclear whether similar ONNX conversion and quantization pipelines would yield comparable latency improvements. Without such comparisons, it is difficult to determine whether the observed speedup originates from the proposed design itself or simply from standard deployment optimization techniques.</w:t>
       </w:r>
     </w:p>
     <w:p>
@@ -184,7 +214,15 @@
         <w:jc w:val="both"/>
       </w:pPr>
       <w:r>
-        <w:t>We appreciate the reviewer’s constructive critique regarding the need for an end-to-end comparative analysis with existing works to isolate the source of the observed latency improvements. We agree that comparing our findings against the models discussed in Section 2 under identical conditions would be highly valuable. However, a major challenge in this domain is that the authors of those works have not provided publicly accessible code repositories, pre-trained model weights, or sufficient implementation details to allow for an exact, fair replication on our hardware and compiler stack. Because deep learning latency is highly sensitive to hardware specifications, batch sizes, and minor compiler differences, comparing our optimized results directly against the absolute latency numbers reported in those papers would not be scientifically rigorous or fair.</w:t>
+        <w:t xml:space="preserve">We appreciate the reviewer’s constructive critique regarding the need for an end-to-end comparative analysis with existing works to isolate the source of the observed latency improvements. We agree that comparing our findings </w:t>
+      </w:r>
+      <w:proofErr w:type="gramStart"/>
+      <w:r>
+        <w:t>against</w:t>
+      </w:r>
+      <w:proofErr w:type="gramEnd"/>
+      <w:r>
+        <w:t xml:space="preserve"> the models discussed in Section 2 under identical conditions would be highly valuable. However, a major challenge in this domain is that the authors of those works have not provided publicly accessible code repositories, pre-trained model weights, or sufficient implementation details to allow for an exact, fair replication on our hardware and compiler stack. Because deep learning latency is highly sensitive to hardware specifications, batch sizes, and minor compiler differences, comparing our optimized results directly against the absolute latency numbers reported in those papers would not be scientifically rigorous or fair.</w:t>
       </w:r>
     </w:p>
     <w:p>
@@ -226,7 +264,15 @@
         <w:jc w:val="both"/>
       </w:pPr>
       <w:r>
-        <w:t>By training and running these models through our Keras, ONNX, and dynamic/static quantization workflows, we have isolated the effects of the architecture versus the deployment pipeline:</w:t>
+        <w:t xml:space="preserve">By training and running these models through our </w:t>
+      </w:r>
+      <w:proofErr w:type="spellStart"/>
+      <w:r>
+        <w:t>Keras</w:t>
+      </w:r>
+      <w:proofErr w:type="spellEnd"/>
+      <w:r>
+        <w:t>, ONNX, and dynamic/static quantization workflows, we have isolated the effects of the architecture versus the deployment pipeline:</w:t>
       </w:r>
     </w:p>
     <w:p>
@@ -351,7 +397,15 @@
         <w:jc w:val="both"/>
       </w:pPr>
       <w:r>
-        <w:t>By isolating the marginal speedup contributed by Keras-to-ONNX conversion, dynamic quantization, and static quantization.</w:t>
+        <w:t xml:space="preserve">By isolating the marginal speedup contributed by </w:t>
+      </w:r>
+      <w:proofErr w:type="spellStart"/>
+      <w:r>
+        <w:t>Keras</w:t>
+      </w:r>
+      <w:proofErr w:type="spellEnd"/>
+      <w:r>
+        <w:t>-to-ONNX conversion, dynamic quantization, and static quantization.</w:t>
       </w:r>
     </w:p>
     <w:p>
@@ -384,7 +438,15 @@
         <w:jc w:val="both"/>
       </w:pPr>
       <w:r>
-        <w:t>The paper focuses primarily on raw model inference latency. However, for practical real-time deployment, end-to-end latency (e.g., feature extraction, preprocessing, packet parsing, and flow aggregation overhead) is often more important than standalone forward-pass time. Therefore, evaluating only inference time may not sufficiently support the real-time deployment claim. The authors are encouraged to provide an end-to-end evaluation and quantify how much overall system-level latency reduction can actually be achieved under realistic deployment settings.</w:t>
+        <w:t xml:space="preserve">The paper focuses primarily on raw model inference latency. However, for practical real-time deployment, end-to-end latency (e.g., feature extraction, preprocessing, packet parsing, and flow aggregation overhead) is often more important than standalone forward-pass time. Therefore, evaluating only inference time may not sufficiently support the real-time deployment claim. The authors are encouraged to provide an end-to-end evaluation and quantify how much overall system-level latency reduction can </w:t>
+      </w:r>
+      <w:proofErr w:type="gramStart"/>
+      <w:r>
+        <w:t>actually be</w:t>
+      </w:r>
+      <w:proofErr w:type="gramEnd"/>
+      <w:r>
+        <w:t xml:space="preserve"> achieved under realistic deployment settings.</w:t>
       </w:r>
     </w:p>
     <w:p>
@@ -428,8 +490,21 @@
         </w:numPr>
         <w:jc w:val="both"/>
       </w:pPr>
-      <w:r>
-        <w:t>eBPF/XDP (Extended Berkeley Packet Filter / eXpress Data Path): Operating directly in the Linux kernel driver space to parse packets at line rate with sub-microsecond overhead.</w:t>
+      <w:proofErr w:type="spellStart"/>
+      <w:r>
+        <w:t>eBPF</w:t>
+      </w:r>
+      <w:proofErr w:type="spellEnd"/>
+      <w:r>
+        <w:t xml:space="preserve">/XDP (Extended Berkeley Packet Filter / </w:t>
+      </w:r>
+      <w:proofErr w:type="spellStart"/>
+      <w:r>
+        <w:t>eXpress</w:t>
+      </w:r>
+      <w:proofErr w:type="spellEnd"/>
+      <w:r>
+        <w:t xml:space="preserve"> Data Path): Operating directly in the Linux kernel driver space to parse packets at line rate with sub-microsecond overhead.</w:t>
       </w:r>
     </w:p>
     <w:p>
@@ -441,8 +516,13 @@
         </w:numPr>
         <w:jc w:val="both"/>
       </w:pPr>
-      <w:r>
-        <w:t>SmartNICs and DPDK (Data Plane Development Kit): Bypassing kernel overheads completely to execute real-time flow aggregation directly in hardware.</w:t>
+      <w:proofErr w:type="spellStart"/>
+      <w:r>
+        <w:t>SmartNICs</w:t>
+      </w:r>
+      <w:proofErr w:type="spellEnd"/>
+      <w:r>
+        <w:t xml:space="preserve"> and DPDK (Data Plane Development Kit): Bypassing kernel overheads completely to execute real-time flow aggregation directly in hardware.</w:t>
       </w:r>
     </w:p>
     <w:p>
@@ -689,7 +769,11 @@
         <w:t>‑</w:t>
       </w:r>
       <w:r>
-        <w:t>sample latency (batch size = 1) with proper warm</w:t>
+        <w:t xml:space="preserve">sample latency (batch size = 1) with proper </w:t>
+      </w:r>
+      <w:proofErr w:type="gramStart"/>
+      <w:r>
+        <w:t>warm</w:t>
       </w:r>
       <w:r>
         <w:rPr>
@@ -698,7 +782,11 @@
         <w:t>‑</w:t>
       </w:r>
       <w:r>
-        <w:t xml:space="preserve">up and repetitions. Report mean </w:t>
+        <w:t>up</w:t>
+      </w:r>
+      <w:proofErr w:type="gramEnd"/>
+      <w:r>
+        <w:t xml:space="preserve"> and repetitions. Report mean </w:t>
       </w:r>
       <w:r>
         <w:rPr>
@@ -765,7 +853,15 @@
         <w:jc w:val="both"/>
       </w:pPr>
       <w:r>
-        <w:t>In high-throughput intrusion detection systems (IDS) and DDoS mitigation pipelines, data does not typically arrive or get processed in a strictly sequential, blocking, single-sample (B = 1) fashion. Modern high-speed packet processing frameworks (such as DPDK or SmartNIC architectures) utilize burst-based processing (e.g., retrieving packets from the NIC ring buffer in bursts/batches of B = 32 or B = 64) to avoid the massive CPU interrupt overhead of packet-by-packet handling. Therefore, profiling batched performance and reporting the amortized, batch-averaged latency provides network security engineers with a far more realistic representation of how these optimized models perform under high-throughput line-rate loads.</w:t>
+        <w:t xml:space="preserve">In high-throughput intrusion detection systems (IDS) and DDoS mitigation pipelines, data does not typically arrive or get processed in a strictly sequential, blocking, single-sample (B = 1) fashion. Modern high-speed packet processing frameworks (such as DPDK or </w:t>
+      </w:r>
+      <w:proofErr w:type="spellStart"/>
+      <w:r>
+        <w:t>SmartNIC</w:t>
+      </w:r>
+      <w:proofErr w:type="spellEnd"/>
+      <w:r>
+        <w:t xml:space="preserve"> architectures) utilize burst-based processing (e.g., retrieving packets from the NIC ring buffer in bursts/batches of B = 32 or B = 64) to avoid the massive CPU interrupt overhead of packet-by-packet handling. Therefore, profiling batched performance and reporting the amortized, batch-averaged latency provides network security engineers with a far more realistic representation of how these optimized models perform under high-throughput line-rate loads.</w:t>
       </w:r>
     </w:p>
     <w:p>
@@ -806,7 +902,15 @@
         <w:t>‑</w:t>
       </w:r>
       <w:r>
-        <w:t>CNN, or TensorRT) to contextualize the speed/accuracy trade</w:t>
+        <w:t xml:space="preserve">CNN, or </w:t>
+      </w:r>
+      <w:proofErr w:type="spellStart"/>
+      <w:r>
+        <w:t>TensorRT</w:t>
+      </w:r>
+      <w:proofErr w:type="spellEnd"/>
+      <w:r>
+        <w:t>) to contextualize the speed/accuracy trade</w:t>
       </w:r>
       <w:r>
         <w:rPr>
@@ -888,7 +992,15 @@
         <w:t xml:space="preserve"> </w:t>
       </w:r>
       <w:r>
-        <w:t>By training, evaluating, and running these alternative baselines through our exact same compilation (Keras to ONNX) and quantization (static/dynamic INT8) workflows, we have successfully contextualized both the performance boundaries and the relative speedup trends.</w:t>
+        <w:t>By training, evaluating, and running these alternative baselines through our exact same compilation (</w:t>
+      </w:r>
+      <w:proofErr w:type="spellStart"/>
+      <w:r>
+        <w:t>Keras</w:t>
+      </w:r>
+      <w:proofErr w:type="spellEnd"/>
+      <w:r>
+        <w:t xml:space="preserve"> to ONNX) and quantization (static/dynamic INT8) workflows, we have successfully contextualized both the performance boundaries and the relative speedup trends.</w:t>
       </w:r>
     </w:p>
     <w:p>
@@ -1043,7 +1155,15 @@
         <w:jc w:val="both"/>
       </w:pPr>
       <w:r>
-        <w:t>Data preprocessing – Clarify the source of the extra 110k benign samples. Downsample only the training set to avoid leakage.</w:t>
+        <w:t xml:space="preserve">Data preprocessing – Clarify the source of the extra 110k benign samples. </w:t>
+      </w:r>
+      <w:proofErr w:type="spellStart"/>
+      <w:r>
+        <w:t>Downsample</w:t>
+      </w:r>
+      <w:proofErr w:type="spellEnd"/>
+      <w:r>
+        <w:t xml:space="preserve"> only the training set to avoid leakage.</w:t>
       </w:r>
     </w:p>
     <w:p>
@@ -1088,7 +1208,15 @@
         <w:jc w:val="both"/>
       </w:pPr>
       <w:r>
-        <w:t>The target day of the DrDoS attack in the CIC-DDoS-2019 dataset contains an extremely high volume of attack packets but a very scarce number of benign packets. To establish a robust and representative background of normal network behavior, we harvested and merged all available benign traffic profiles from the other days of the same official CIC-DDoS-2019 dataset. This allowed us to compile a total of 113,828 benign samples.</w:t>
+        <w:t xml:space="preserve">The target day of the </w:t>
+      </w:r>
+      <w:proofErr w:type="spellStart"/>
+      <w:r>
+        <w:t>DrDoS</w:t>
+      </w:r>
+      <w:proofErr w:type="spellEnd"/>
+      <w:r>
+        <w:t xml:space="preserve"> attack in the CIC-DDoS-2019 dataset contains an extremely high volume of attack packets but a very scarce number of benign packets. To establish a robust and representative background of normal network behavior, we harvested and merged all available benign traffic profiles from the other days of the same official CIC-DDoS-2019 dataset. This allowed us to compile a total of 113,828 benign samples.</w:t>
       </w:r>
     </w:p>
     <w:p>
@@ -1101,7 +1229,23 @@
         <w:jc w:val="both"/>
       </w:pPr>
       <w:r>
-        <w:t>Even with all 113,828 benign samples consolidated, the ratio of benign to DrDoS attack packets remained heavily imbalanced at approximately 1:44. To prevent biased learning and ensure the models could accurately characterize the minority (benign) class, we applied downsampling.</w:t>
+        <w:t xml:space="preserve">Even with all 113,828 benign samples consolidated, the ratio of benign to </w:t>
+      </w:r>
+      <w:proofErr w:type="spellStart"/>
+      <w:r>
+        <w:t>DrDoS</w:t>
+      </w:r>
+      <w:proofErr w:type="spellEnd"/>
+      <w:r>
+        <w:t xml:space="preserve"> attack packets remained heavily imbalanced at approximately 1:44. To prevent biased learning and ensure the models could accurately characterize the minority (benign) class, we applied </w:t>
+      </w:r>
+      <w:proofErr w:type="spellStart"/>
+      <w:r>
+        <w:t>downsampling</w:t>
+      </w:r>
+      <w:proofErr w:type="spellEnd"/>
+      <w:r>
+        <w:t>.</w:t>
       </w:r>
     </w:p>
     <w:p>
@@ -1113,8 +1257,37 @@
         </w:numPr>
         <w:jc w:val="both"/>
       </w:pPr>
-      <w:r>
-        <w:t>Downsampling was applied exclusively to the majority attack class (DrDoS). We preserved 100% of the collected benign samples (113,828 packets) and randomly subsampled the massive DrDoS packet pool down to 227,656 packets, yielding a structured 1:2 (Benign to DrDoS) ratio.</w:t>
+      <w:proofErr w:type="spellStart"/>
+      <w:r>
+        <w:t>Downsampling</w:t>
+      </w:r>
+      <w:proofErr w:type="spellEnd"/>
+      <w:r>
+        <w:t xml:space="preserve"> was applied exclusively to the majority attack class (</w:t>
+      </w:r>
+      <w:proofErr w:type="spellStart"/>
+      <w:r>
+        <w:t>DrDoS</w:t>
+      </w:r>
+      <w:proofErr w:type="spellEnd"/>
+      <w:r>
+        <w:t xml:space="preserve">). We preserved 100% of the collected benign samples (113,828 packets) and randomly subsampled the massive </w:t>
+      </w:r>
+      <w:proofErr w:type="spellStart"/>
+      <w:r>
+        <w:t>DrDoS</w:t>
+      </w:r>
+      <w:proofErr w:type="spellEnd"/>
+      <w:r>
+        <w:t xml:space="preserve"> packet pool down to 227,656 packets, yielding a structured 1:2 (Benign to </w:t>
+      </w:r>
+      <w:proofErr w:type="spellStart"/>
+      <w:r>
+        <w:t>DrDoS</w:t>
+      </w:r>
+      <w:proofErr w:type="spellEnd"/>
+      <w:r>
+        <w:t>) ratio.</w:t>
       </w:r>
     </w:p>
     <w:p>
@@ -1127,7 +1300,15 @@
         <w:jc w:val="both"/>
       </w:pPr>
       <w:r>
-        <w:t>Because the downsampling process is a simple, uniform random selection of samples from a single, homogeneous class without utilizing any statistical feature parameterization (such as mean, variance, or scaling parameters) or sample duplication it does not transfer any information across the eventual train-test split boundary. Thus, executing this uniform subsampling on the global attack pool prior to the train-test partition is mathematically leak-free and guarantees that our evaluation metrics on the test set remain highly reliable.</w:t>
+        <w:t xml:space="preserve">Because the </w:t>
+      </w:r>
+      <w:proofErr w:type="spellStart"/>
+      <w:r>
+        <w:t>downsampling</w:t>
+      </w:r>
+      <w:proofErr w:type="spellEnd"/>
+      <w:r>
+        <w:t xml:space="preserve"> process is a simple, uniform random selection of samples from a single, homogeneous class without utilizing any statistical feature parameterization (such as mean, variance, or scaling parameters) or sample duplication it does not transfer any information across the eventual train-test split boundary. Thus, executing this uniform subsampling on the global attack pool prior to the train-test partition is mathematically leak-free and guarantees that our evaluation metrics on the test set remain highly reliable.</w:t>
       </w:r>
     </w:p>
     <w:p>
@@ -1197,7 +1378,15 @@
         <w:jc w:val="both"/>
       </w:pPr>
       <w:r>
-        <w:t>We have explicitly documented the exact software dependency versions (such as Python, TensorFlow/Keras, and ONNX Runtime versions), model training hyperparameters, and the specific random seeds within the Supplementary Materials. This ensures that the computational environment and stochastic processes can be replicated.</w:t>
+        <w:t>We have explicitly documented the exact software dependency versions (such as Python, TensorFlow/</w:t>
+      </w:r>
+      <w:proofErr w:type="spellStart"/>
+      <w:r>
+        <w:t>Keras</w:t>
+      </w:r>
+      <w:proofErr w:type="spellEnd"/>
+      <w:r>
+        <w:t>, and ONNX Runtime versions), model training hyperparameters, and the specific random seeds within the Supplementary Materials. This ensures that the computational environment and stochastic processes can be replicated.</w:t>
       </w:r>
     </w:p>
     <w:p>
@@ -1456,7 +1645,31 @@
         <w:jc w:val="both"/>
       </w:pPr>
       <w:r>
-        <w:t>The English is generally understandable, but it requires proofreading and minor corrections before final acceptance. Several typographical errors were identified (e.g., “withouut” instead of “without”, inconsistent spelling of “down sampling” as two words). Additionally, some sentences are overly long or slightly awkward, which occasionally obscures meaning. Abbreviations (e.g., “DrDoS” vs “DNS DrDoS”) should be used consistently throughout the manuscript. A careful copy</w:t>
+        <w:t>The English is generally understandable, but it requires proofreading and minor corrections before final acceptance. Several typographical errors were identified (e.g., “</w:t>
+      </w:r>
+      <w:proofErr w:type="spellStart"/>
+      <w:r>
+        <w:t>withouut</w:t>
+      </w:r>
+      <w:proofErr w:type="spellEnd"/>
+      <w:r>
+        <w:t>” instead of “without”, inconsistent spelling of “down sampling” as two words). Additionally, some sentences are overly long or slightly awkward, which occasionally obscures meaning. Abbreviations (e.g., “</w:t>
+      </w:r>
+      <w:proofErr w:type="spellStart"/>
+      <w:r>
+        <w:t>DrDoS</w:t>
+      </w:r>
+      <w:proofErr w:type="spellEnd"/>
+      <w:r>
+        <w:t xml:space="preserve">” vs “DNS </w:t>
+      </w:r>
+      <w:proofErr w:type="spellStart"/>
+      <w:r>
+        <w:t>DrDoS</w:t>
+      </w:r>
+      <w:proofErr w:type="spellEnd"/>
+      <w:r>
+        <w:t>”) should be used consistently throughout the manuscript. A careful copy</w:t>
       </w:r>
       <w:r>
         <w:rPr>
@@ -1489,13 +1702,7 @@
         <w:jc w:val="both"/>
       </w:pPr>
       <w:r>
-        <w:t xml:space="preserve">We sincerely thank the </w:t>
-      </w:r>
-      <w:r>
-        <w:t>reviewers</w:t>
-      </w:r>
-      <w:r>
-        <w:t xml:space="preserve"> for their careful reading of our manuscript and for pointing out these language and formatting issues. </w:t>
+        <w:t xml:space="preserve">We sincerely thank the reviewers for their careful reading of our manuscript and for pointing out these language and formatting issues. </w:t>
       </w:r>
     </w:p>
     <w:p>
@@ -1516,7 +1723,15 @@
         <w:jc w:val="both"/>
       </w:pPr>
       <w:r>
-        <w:t>We have thoroughly proofread the entire manuscript to identify and correct all typographical errors. Specific instances highlighted by the reviewer (such as correcting "withouut" to "without") have been resolved.</w:t>
+        <w:t>We have thoroughly proofread the entire manuscript to identify and correct all typographical errors. Specific instances highlighted by the reviewer (such as correcting "</w:t>
+      </w:r>
+      <w:proofErr w:type="spellStart"/>
+      <w:r>
+        <w:t>withouut</w:t>
+      </w:r>
+      <w:proofErr w:type="spellEnd"/>
+      <w:r>
+        <w:t>" to "without") have been resolved.</w:t>
       </w:r>
     </w:p>
     <w:p>
@@ -1529,7 +1744,23 @@
         <w:jc w:val="both"/>
       </w:pPr>
       <w:r>
-        <w:t>We have standardized key terms and abbreviations across all sections. For instance, "down-sampling" is now spelled consistently with a hyphen, and abbreviations like "DrDoS" and "DNS DrDoS" are applied systematically.</w:t>
+        <w:t>We have standardized key terms and abbreviations across all sections. For instance, "down-sampling" is now spelled consistently with a hyphen, and abbreviations like "</w:t>
+      </w:r>
+      <w:proofErr w:type="spellStart"/>
+      <w:r>
+        <w:t>DrDoS</w:t>
+      </w:r>
+      <w:proofErr w:type="spellEnd"/>
+      <w:r>
+        <w:t xml:space="preserve">" and "DNS </w:t>
+      </w:r>
+      <w:proofErr w:type="spellStart"/>
+      <w:r>
+        <w:t>DrDoS</w:t>
+      </w:r>
+      <w:proofErr w:type="spellEnd"/>
+      <w:r>
+        <w:t>" are applied systematically.</w:t>
       </w:r>
     </w:p>
     <w:p>
@@ -1574,7 +1805,15 @@
         <w:jc w:val="both"/>
       </w:pPr>
       <w:r>
-        <w:t>Please add the correlation with the symmetry concept in your abstract and main text so that readers could know clearly the paper's relevance to our journal Symmetry when they start to read the papers.</w:t>
+        <w:t xml:space="preserve">Please add the correlation with the symmetry concept in your abstract and main text so that readers </w:t>
+      </w:r>
+      <w:proofErr w:type="gramStart"/>
+      <w:r>
+        <w:t>could</w:t>
+      </w:r>
+      <w:proofErr w:type="gramEnd"/>
+      <w:r>
+        <w:t xml:space="preserve"> know clearly the paper's relevance to our journal Symmetry when they start to read the papers.</w:t>
       </w:r>
       <w:r>
         <w:br/>
@@ -1618,15 +1857,7 @@
       </w:r>
       <w:r>
         <w:br/>
-      </w:r>
-      <w:r>
-        <w:t>For commercial funding, the role of the funder must be declared. We</w:t>
-      </w:r>
-      <w:r>
-        <w:t xml:space="preserve"> </w:t>
-      </w:r>
-      <w:r>
-        <w:t>recommend inserting the following statements into the manuscript’s</w:t>
+        <w:t>For commercial funding, the role of the funder must be declared. We recommend inserting the following statements into the manuscript’s</w:t>
       </w:r>
     </w:p>
     <w:p>
@@ -1639,13 +1870,7 @@
     </w:p>
     <w:p>
       <w:r>
-        <w:t>"The authors declare that this study received funding from XXXXXXX. The</w:t>
-      </w:r>
-      <w:r>
-        <w:t xml:space="preserve"> </w:t>
-      </w:r>
-      <w:r>
-        <w:t>funder had the following involvement with the study: XXXXXXX".</w:t>
+        <w:t>"The authors declare that this study received funding from XXXXXXX. The funder had the following involvement with the study: XXXXXXX".</w:t>
       </w:r>
     </w:p>
     <w:p>
@@ -1668,25 +1893,15 @@
         <w:t> </w:t>
       </w:r>
       <w:r>
-        <w:t>from XXXXXXX. The</w:t>
-      </w:r>
-      <w:r>
-        <w:t xml:space="preserve"> </w:t>
-      </w:r>
-      <w:r>
-        <w:t>funder was not involved in the study design, collection, analysis,</w:t>
-      </w:r>
-      <w:r>
-        <w:t xml:space="preserve"> </w:t>
-      </w:r>
-      <w:r>
-        <w:t>interpretation of data, the writing of this article or the decision to</w:t>
-      </w:r>
-      <w:r>
-        <w:t xml:space="preserve"> </w:t>
-      </w:r>
-      <w:r>
-        <w:t>submit it for publication".</w:t>
+        <w:t xml:space="preserve">from XXXXXXX. The </w:t>
+      </w:r>
+      <w:proofErr w:type="gramStart"/>
+      <w:r>
+        <w:t>funder</w:t>
+      </w:r>
+      <w:proofErr w:type="gramEnd"/>
+      <w:r>
+        <w:t xml:space="preserve"> was not involved in the study design, collection, analysis, interpretation of data, the writing of this article or the decision to submit it for publication".</w:t>
       </w:r>
     </w:p>
     <w:p>
@@ -1712,13 +1927,7 @@
         <w:t>editor</w:t>
       </w:r>
       <w:r>
-        <w:t xml:space="preserve">’s guidance regarding the declaration of commercial funding. In accordance with your recommendation and the journal's disclosure policies, we have updated the </w:t>
-      </w:r>
-      <w:r>
-        <w:t>Conflict-of-Interest</w:t>
-      </w:r>
-      <w:r>
-        <w:t xml:space="preserve"> section of our manuscript. Because the funding organization played no role in the execution of the research or the preparation of the manuscript, we have adopted the second statement format you provided to explicitly define this relationship.</w:t>
+        <w:t>’s guidance regarding the declaration of commercial funding. In accordance with your recommendation and the journal's disclosure policies, we have updated the Conflict-of-Interest section of our manuscript. Because the funding organization played no role in the execution of the research or the preparation of the manuscript, we have adopted the second statement format you provided to explicitly define this relationship.</w:t>
       </w:r>
     </w:p>
     <w:p>

</xml_diff>